<commit_message>
Atualização Caso de Uso
</commit_message>
<xml_diff>
--- a/Caso de Uso do Gerenciador de Notas.docx
+++ b/Caso de Uso do Gerenciador de Notas.docx
@@ -1,6 +1,6 @@
 
 <file path=word/document.xml><?xml version="1.0" encoding="utf-8"?>
-<w:document xmlns:wpc="http://schemas.microsoft.com/office/word/2010/wordprocessingCanvas" xmlns:cx="http://schemas.microsoft.com/office/drawing/2014/chartex" xmlns:cx1="http://schemas.microsoft.com/office/drawing/2015/9/8/chartex" xmlns:cx2="http://schemas.microsoft.com/office/drawing/2015/10/21/chartex" xmlns:cx3="http://schemas.microsoft.com/office/drawing/2016/5/9/chartex" xmlns:cx4="http://schemas.microsoft.com/office/drawing/2016/5/10/chartex" xmlns:cx5="http://schemas.microsoft.com/office/drawing/2016/5/11/chartex" xmlns:cx6="http://schemas.microsoft.com/office/drawing/2016/5/12/chartex" xmlns:cx7="http://schemas.microsoft.com/office/drawing/2016/5/13/chartex" xmlns:cx8="http://schemas.microsoft.com/office/drawing/2016/5/14/chartex" xmlns:mc="http://schemas.openxmlformats.org/markup-compatibility/2006" xmlns:aink="http://schemas.microsoft.com/office/drawing/2016/ink" xmlns:am3d="http://schemas.microsoft.com/office/drawing/2017/model3d" xmlns:o="urn:schemas-microsoft-com:office:office" xmlns:oel="http://schemas.microsoft.com/office/2019/extlst" xmlns:r="http://schemas.openxmlformats.org/officeDocument/2006/relationships" xmlns:m="http://schemas.openxmlformats.org/officeDocument/2006/math" xmlns:v="urn:schemas-microsoft-com:vml" xmlns:wp14="http://schemas.microsoft.com/office/word/2010/wordprocessingDrawing" xmlns:wp="http://schemas.openxmlformats.org/drawingml/2006/wordprocessingDrawing" xmlns:w10="urn:schemas-microsoft-com:office:word" xmlns:w="http://schemas.openxmlformats.org/wordprocessingml/2006/main" xmlns:w14="http://schemas.microsoft.com/office/word/2010/wordml" xmlns:w15="http://schemas.microsoft.com/office/word/2012/wordml" xmlns:w16cex="http://schemas.microsoft.com/office/word/2018/wordml/cex" xmlns:w16cid="http://schemas.microsoft.com/office/word/2016/wordml/cid" xmlns:w16="http://schemas.microsoft.com/office/word/2018/wordml" xmlns:w16sdtdh="http://schemas.microsoft.com/office/word/2020/wordml/sdtdatahash" xmlns:w16se="http://schemas.microsoft.com/office/word/2015/wordml/symex" xmlns:wpg="http://schemas.microsoft.com/office/word/2010/wordprocessingGroup" xmlns:wpi="http://schemas.microsoft.com/office/word/2010/wordprocessingInk" xmlns:wne="http://schemas.microsoft.com/office/word/2006/wordml" xmlns:wps="http://schemas.microsoft.com/office/word/2010/wordprocessingShape" mc:Ignorable="w14 w15 w16se w16cid w16 w16cex w16sdtdh wp14">
+<w:document xmlns:wpc="http://schemas.microsoft.com/office/word/2010/wordprocessingCanvas" xmlns:cx="http://schemas.microsoft.com/office/drawing/2014/chartex" xmlns:cx1="http://schemas.microsoft.com/office/drawing/2015/9/8/chartex" xmlns:cx2="http://schemas.microsoft.com/office/drawing/2015/10/21/chartex" xmlns:cx3="http://schemas.microsoft.com/office/drawing/2016/5/9/chartex" xmlns:cx4="http://schemas.microsoft.com/office/drawing/2016/5/10/chartex" xmlns:cx5="http://schemas.microsoft.com/office/drawing/2016/5/11/chartex" xmlns:cx6="http://schemas.microsoft.com/office/drawing/2016/5/12/chartex" xmlns:cx7="http://schemas.microsoft.com/office/drawing/2016/5/13/chartex" xmlns:cx8="http://schemas.microsoft.com/office/drawing/2016/5/14/chartex" xmlns:mc="http://schemas.openxmlformats.org/markup-compatibility/2006" xmlns:aink="http://schemas.microsoft.com/office/drawing/2016/ink" xmlns:am3d="http://schemas.microsoft.com/office/drawing/2017/model3d" xmlns:o="urn:schemas-microsoft-com:office:office" xmlns:r="http://schemas.openxmlformats.org/officeDocument/2006/relationships" xmlns:m="http://schemas.openxmlformats.org/officeDocument/2006/math" xmlns:v="urn:schemas-microsoft-com:vml" xmlns:wp14="http://schemas.microsoft.com/office/word/2010/wordprocessingDrawing" xmlns:wp="http://schemas.openxmlformats.org/drawingml/2006/wordprocessingDrawing" xmlns:w10="urn:schemas-microsoft-com:office:word" xmlns:w="http://schemas.openxmlformats.org/wordprocessingml/2006/main" xmlns:w14="http://schemas.microsoft.com/office/word/2010/wordml" xmlns:w15="http://schemas.microsoft.com/office/word/2012/wordml" xmlns:w16cex="http://schemas.microsoft.com/office/word/2018/wordml/cex" xmlns:w16cid="http://schemas.microsoft.com/office/word/2016/wordml/cid" xmlns:w16="http://schemas.microsoft.com/office/word/2018/wordml" xmlns:w16sdtdh="http://schemas.microsoft.com/office/word/2020/wordml/sdtdatahash" xmlns:w16se="http://schemas.microsoft.com/office/word/2015/wordml/symex" xmlns:wpg="http://schemas.microsoft.com/office/word/2010/wordprocessingGroup" xmlns:wpi="http://schemas.microsoft.com/office/word/2010/wordprocessingInk" xmlns:wne="http://schemas.microsoft.com/office/word/2006/wordml" xmlns:wps="http://schemas.microsoft.com/office/word/2010/wordprocessingShape" mc:Ignorable="w14 w15 w16se w16cid w16 w16cex w16sdtdh wp14">
   <w:body>
     <w:p>
       <w:pPr>
@@ -24,31 +24,91 @@
     <w:p>
       <w:pPr>
         <w:rPr>
+          <w:sz w:val="20"/>
+          <w:szCs w:val="20"/>
+        </w:rPr>
+      </w:pPr>
+      <w:r>
+        <w:rPr>
+          <w:sz w:val="20"/>
+          <w:szCs w:val="20"/>
+        </w:rPr>
+        <w:t>Inicia o Software</w:t>
+      </w:r>
+    </w:p>
+    <w:p>
+      <w:pPr>
+        <w:rPr>
+          <w:sz w:val="20"/>
+          <w:szCs w:val="20"/>
+        </w:rPr>
+      </w:pPr>
+      <w:r>
+        <w:rPr>
+          <w:sz w:val="20"/>
+          <w:szCs w:val="20"/>
+        </w:rPr>
+        <w:t>Ele escolhe as opções disponíveis entre adicionar nota, consultar nota, alterar nota</w:t>
+      </w:r>
+      <w:r>
+        <w:rPr>
+          <w:sz w:val="20"/>
+          <w:szCs w:val="20"/>
+        </w:rPr>
+        <w:t xml:space="preserve">, </w:t>
+      </w:r>
+      <w:r>
+        <w:rPr>
+          <w:sz w:val="20"/>
+          <w:szCs w:val="20"/>
+        </w:rPr>
+        <w:t>excluir nota</w:t>
+      </w:r>
+      <w:r>
+        <w:rPr>
+          <w:sz w:val="20"/>
+          <w:szCs w:val="20"/>
+        </w:rPr>
+        <w:t xml:space="preserve"> ou sair</w:t>
+      </w:r>
+    </w:p>
+    <w:p>
+      <w:pPr>
+        <w:rPr>
           <w:b/>
           <w:bCs/>
-          <w:sz w:val="32"/>
-          <w:szCs w:val="32"/>
-        </w:rPr>
-      </w:pPr>
-    </w:p>
-    <w:p>
-      <w:r>
-        <w:t>Inicia o Software</w:t>
-      </w:r>
-    </w:p>
-    <w:p>
-      <w:r>
-        <w:t>Ele escolhe as opções disponíveis entre adicionar nota, consultar nota, alterar nota</w:t>
-      </w:r>
-      <w:r>
-        <w:t xml:space="preserve">, </w:t>
-      </w:r>
-      <w:r>
-        <w:t>excluir nota</w:t>
-      </w:r>
-      <w:r>
-        <w:t xml:space="preserve"> ou sair</w:t>
-      </w:r>
+        </w:rPr>
+      </w:pPr>
+      <w:r>
+        <w:rPr>
+          <w:b/>
+          <w:bCs/>
+        </w:rPr>
+        <w:t>Fluxo Alternativo</w:t>
+      </w:r>
+    </w:p>
+    <w:p>
+      <w:pPr>
+        <w:rPr>
+          <w:sz w:val="20"/>
+          <w:szCs w:val="20"/>
+        </w:rPr>
+      </w:pPr>
+      <w:r>
+        <w:rPr>
+          <w:sz w:val="20"/>
+          <w:szCs w:val="20"/>
+        </w:rPr>
+        <w:t>Caso o usuário não escolha nenhuma opção, vai mandar uma mensagem de erro e repetir o processo</w:t>
+      </w:r>
+    </w:p>
+    <w:p>
+      <w:pPr>
+        <w:rPr>
+          <w:b/>
+          <w:bCs/>
+        </w:rPr>
+      </w:pPr>
     </w:p>
     <w:p/>
     <w:p>
@@ -71,26 +131,151 @@
       </w:r>
     </w:p>
     <w:p>
-      <w:r>
+      <w:pPr>
+        <w:rPr>
+          <w:sz w:val="20"/>
+          <w:szCs w:val="20"/>
+        </w:rPr>
+      </w:pPr>
+      <w:r>
+        <w:rPr>
+          <w:sz w:val="20"/>
+          <w:szCs w:val="20"/>
+        </w:rPr>
         <w:t>O usuário insere o nome do aluno</w:t>
       </w:r>
     </w:p>
     <w:p>
-      <w:r>
-        <w:t xml:space="preserve">O usuário insere o </w:t>
-      </w:r>
-      <w:r>
-        <w:t>a nota do aluno</w:t>
-      </w:r>
-    </w:p>
-    <w:p>
-      <w:r>
+      <w:pPr>
+        <w:rPr>
+          <w:sz w:val="20"/>
+          <w:szCs w:val="20"/>
+        </w:rPr>
+      </w:pPr>
+      <w:r>
+        <w:rPr>
+          <w:sz w:val="20"/>
+          <w:szCs w:val="20"/>
+        </w:rPr>
+        <w:t>O usuário insere o a nota do aluno</w:t>
+      </w:r>
+    </w:p>
+    <w:p>
+      <w:pPr>
+        <w:rPr>
+          <w:sz w:val="20"/>
+          <w:szCs w:val="20"/>
+        </w:rPr>
+      </w:pPr>
+      <w:r>
+        <w:rPr>
+          <w:sz w:val="20"/>
+          <w:szCs w:val="20"/>
+        </w:rPr>
+        <w:t>O usuário confirma se envia ou não</w:t>
+      </w:r>
+    </w:p>
+    <w:p>
+      <w:pPr>
+        <w:rPr>
+          <w:sz w:val="20"/>
+          <w:szCs w:val="20"/>
+        </w:rPr>
+      </w:pPr>
+      <w:r>
+        <w:rPr>
+          <w:sz w:val="20"/>
+          <w:szCs w:val="20"/>
+        </w:rPr>
         <w:t>O Sistema vai pegar esses dados e colocar num banco de dados</w:t>
       </w:r>
     </w:p>
     <w:p>
-      <w:r>
+      <w:pPr>
+        <w:rPr>
+          <w:sz w:val="20"/>
+          <w:szCs w:val="20"/>
+        </w:rPr>
+      </w:pPr>
+      <w:r>
+        <w:rPr>
+          <w:sz w:val="20"/>
+          <w:szCs w:val="20"/>
+        </w:rPr>
         <w:t>O sistema atribui um índice de fora automática</w:t>
+      </w:r>
+    </w:p>
+    <w:p>
+      <w:pPr>
+        <w:rPr>
+          <w:b/>
+          <w:bCs/>
+        </w:rPr>
+      </w:pPr>
+      <w:r>
+        <w:rPr>
+          <w:b/>
+          <w:bCs/>
+        </w:rPr>
+        <w:t>Fluxo Alternativo</w:t>
+      </w:r>
+    </w:p>
+    <w:p>
+      <w:pPr>
+        <w:rPr>
+          <w:sz w:val="20"/>
+          <w:szCs w:val="20"/>
+        </w:rPr>
+      </w:pPr>
+      <w:r>
+        <w:rPr>
+          <w:sz w:val="20"/>
+          <w:szCs w:val="20"/>
+        </w:rPr>
+        <w:t xml:space="preserve">Caso o usuário não </w:t>
+      </w:r>
+      <w:r>
+        <w:rPr>
+          <w:sz w:val="20"/>
+          <w:szCs w:val="20"/>
+        </w:rPr>
+        <w:t>envie um número válido, o sistema vai bloquear e vai mandar inserir novamente</w:t>
+      </w:r>
+    </w:p>
+    <w:p>
+      <w:pPr>
+        <w:rPr>
+          <w:sz w:val="20"/>
+          <w:szCs w:val="20"/>
+        </w:rPr>
+      </w:pPr>
+      <w:r>
+        <w:rPr>
+          <w:sz w:val="20"/>
+          <w:szCs w:val="20"/>
+        </w:rPr>
+        <w:t>Caso o usuário não escolha nenhuma opção</w:t>
+      </w:r>
+      <w:r>
+        <w:rPr>
+          <w:sz w:val="20"/>
+          <w:szCs w:val="20"/>
+        </w:rPr>
+        <w:t xml:space="preserve"> no momento de confirmar</w:t>
+      </w:r>
+      <w:r>
+        <w:rPr>
+          <w:sz w:val="20"/>
+          <w:szCs w:val="20"/>
+        </w:rPr>
+        <w:t xml:space="preserve">, vai mandar uma mensagem de erro e </w:t>
+      </w:r>
+      <w:r>
+        <w:rPr>
+          <w:sz w:val="20"/>
+          <w:szCs w:val="20"/>
+        </w:rPr>
+        <w:t>retornar à parte inicial</w:t>
       </w:r>
     </w:p>
     <w:p/>
@@ -110,110 +295,418 @@
           <w:sz w:val="28"/>
           <w:szCs w:val="28"/>
         </w:rPr>
-        <w:t>Consultar</w:t>
-      </w:r>
-      <w:r>
+        <w:t>Consultar Nota</w:t>
+      </w:r>
+    </w:p>
+    <w:p>
+      <w:pPr>
+        <w:rPr>
+          <w:sz w:val="20"/>
+          <w:szCs w:val="20"/>
+        </w:rPr>
+      </w:pPr>
+      <w:r>
+        <w:rPr>
+          <w:sz w:val="20"/>
+          <w:szCs w:val="20"/>
+        </w:rPr>
+        <w:t>O Sistema mostra</w:t>
+      </w:r>
+      <w:r>
+        <w:rPr>
+          <w:sz w:val="20"/>
+          <w:szCs w:val="20"/>
+        </w:rPr>
+        <w:t xml:space="preserve"> ao Usuário</w:t>
+      </w:r>
+      <w:r>
+        <w:rPr>
+          <w:sz w:val="20"/>
+          <w:szCs w:val="20"/>
+        </w:rPr>
+        <w:t xml:space="preserve"> todas</w:t>
+      </w:r>
+      <w:r>
+        <w:rPr>
+          <w:sz w:val="20"/>
+          <w:szCs w:val="20"/>
+        </w:rPr>
+        <w:t xml:space="preserve"> as notas que </w:t>
+      </w:r>
+      <w:r>
+        <w:rPr>
+          <w:sz w:val="20"/>
+          <w:szCs w:val="20"/>
+        </w:rPr>
+        <w:t>estão no banco de dados</w:t>
+      </w:r>
+    </w:p>
+    <w:p/>
+    <w:p/>
+    <w:p/>
+    <w:p/>
+    <w:p/>
+    <w:p/>
+    <w:p/>
+    <w:p/>
+    <w:p/>
+    <w:p>
+      <w:pPr>
         <w:rPr>
           <w:b/>
           <w:bCs/>
           <w:sz w:val="28"/>
           <w:szCs w:val="28"/>
         </w:rPr>
-        <w:t xml:space="preserve"> Nota</w:t>
-      </w:r>
-    </w:p>
-    <w:p>
-      <w:r>
-        <w:t xml:space="preserve">O </w:t>
-      </w:r>
-      <w:r>
-        <w:t>Sistema mostra</w:t>
-      </w:r>
-      <w:r>
-        <w:t xml:space="preserve"> ao Usuário</w:t>
-      </w:r>
-      <w:r>
-        <w:t xml:space="preserve"> todas</w:t>
-      </w:r>
-      <w:r>
-        <w:t xml:space="preserve"> as notas que </w:t>
-      </w:r>
-      <w:r>
-        <w:t>estão no banco de dados</w:t>
-      </w:r>
-    </w:p>
-    <w:p/>
-    <w:p>
-      <w:pPr>
+      </w:pPr>
+      <w:r>
         <w:rPr>
           <w:b/>
           <w:bCs/>
           <w:sz w:val="28"/>
           <w:szCs w:val="28"/>
         </w:rPr>
-      </w:pPr>
-      <w:r>
+        <w:lastRenderedPageBreak/>
+        <w:t>Alterar Nota</w:t>
+      </w:r>
+    </w:p>
+    <w:p>
+      <w:pPr>
+        <w:rPr>
+          <w:sz w:val="20"/>
+          <w:szCs w:val="20"/>
+        </w:rPr>
+      </w:pPr>
+      <w:r>
+        <w:rPr>
+          <w:sz w:val="20"/>
+          <w:szCs w:val="20"/>
+        </w:rPr>
+        <w:t>O Usuário insere o número referente ao aluno</w:t>
+      </w:r>
+    </w:p>
+    <w:p>
+      <w:pPr>
+        <w:rPr>
+          <w:sz w:val="20"/>
+          <w:szCs w:val="20"/>
+        </w:rPr>
+      </w:pPr>
+      <w:r>
+        <w:rPr>
+          <w:sz w:val="20"/>
+          <w:szCs w:val="20"/>
+        </w:rPr>
+        <w:t xml:space="preserve">O sistema procura os dados referentes ao índice </w:t>
+      </w:r>
+    </w:p>
+    <w:p>
+      <w:pPr>
+        <w:rPr>
+          <w:sz w:val="20"/>
+          <w:szCs w:val="20"/>
+        </w:rPr>
+      </w:pPr>
+      <w:r>
+        <w:rPr>
+          <w:sz w:val="20"/>
+          <w:szCs w:val="20"/>
+        </w:rPr>
+        <w:t>O Usuário coloca o a nova nota</w:t>
+      </w:r>
+    </w:p>
+    <w:p>
+      <w:pPr>
+        <w:rPr>
+          <w:sz w:val="20"/>
+          <w:szCs w:val="20"/>
+        </w:rPr>
+      </w:pPr>
+      <w:r>
+        <w:rPr>
+          <w:sz w:val="20"/>
+          <w:szCs w:val="20"/>
+        </w:rPr>
+        <w:t>O sistema sobrepõe a nota nova sobre a nota antiga</w:t>
+      </w:r>
+    </w:p>
+    <w:p>
+      <w:pPr>
+        <w:rPr>
+          <w:sz w:val="20"/>
+          <w:szCs w:val="20"/>
+        </w:rPr>
+      </w:pPr>
+      <w:r>
+        <w:rPr>
+          <w:sz w:val="20"/>
+          <w:szCs w:val="20"/>
+        </w:rPr>
+        <w:t>O sistema atualiza o Banco de Dados</w:t>
+      </w:r>
+    </w:p>
+    <w:p>
+      <w:pPr>
+        <w:rPr>
+          <w:sz w:val="20"/>
+          <w:szCs w:val="20"/>
+        </w:rPr>
+      </w:pPr>
+      <w:r>
+        <w:rPr>
+          <w:sz w:val="20"/>
+          <w:szCs w:val="20"/>
+        </w:rPr>
+        <w:t>O sistema confirma a alteração</w:t>
+      </w:r>
+    </w:p>
+    <w:p>
+      <w:pPr>
+        <w:rPr>
+          <w:b/>
+          <w:bCs/>
+        </w:rPr>
+      </w:pPr>
+      <w:r>
+        <w:rPr>
+          <w:b/>
+          <w:bCs/>
+        </w:rPr>
+        <w:t>Fluxo Alternativo</w:t>
+      </w:r>
+    </w:p>
+    <w:p>
+      <w:pPr>
+        <w:rPr>
+          <w:sz w:val="20"/>
+          <w:szCs w:val="20"/>
+        </w:rPr>
+      </w:pPr>
+      <w:r>
+        <w:rPr>
+          <w:sz w:val="20"/>
+          <w:szCs w:val="20"/>
+        </w:rPr>
+        <w:t xml:space="preserve">Caso o usuário não </w:t>
+      </w:r>
+      <w:r>
+        <w:rPr>
+          <w:sz w:val="20"/>
+          <w:szCs w:val="20"/>
+        </w:rPr>
+        <w:t>insira um index válido</w:t>
+      </w:r>
+      <w:r>
+        <w:rPr>
+          <w:sz w:val="20"/>
+          <w:szCs w:val="20"/>
+        </w:rPr>
+        <w:t>, o sistema vai bloquear e vai mandar inserir novamente</w:t>
+      </w:r>
+    </w:p>
+    <w:p>
+      <w:pPr>
+        <w:rPr>
+          <w:sz w:val="20"/>
+          <w:szCs w:val="20"/>
+        </w:rPr>
+      </w:pPr>
+      <w:r>
+        <w:rPr>
+          <w:sz w:val="20"/>
+          <w:szCs w:val="20"/>
+        </w:rPr>
+        <w:t>Caso o usuário não envie um número válido, o sistema vai bloquear e vai mandar inserir novamente</w:t>
+      </w:r>
+    </w:p>
+    <w:p>
+      <w:pPr>
+        <w:rPr>
+          <w:sz w:val="20"/>
+          <w:szCs w:val="20"/>
+        </w:rPr>
+      </w:pPr>
+      <w:r>
+        <w:rPr>
+          <w:sz w:val="20"/>
+          <w:szCs w:val="20"/>
+        </w:rPr>
+        <w:t>Caso o usuário não escolha nenhuma opção no momento de confirmar, vai mandar uma mensagem de erro e retornar à parte inicial</w:t>
+      </w:r>
+    </w:p>
+    <w:p>
+      <w:pPr>
+        <w:rPr>
+          <w:sz w:val="20"/>
+          <w:szCs w:val="20"/>
+        </w:rPr>
+      </w:pPr>
+    </w:p>
+    <w:p/>
+    <w:p>
+      <w:pPr>
         <w:rPr>
           <w:b/>
           <w:bCs/>
           <w:sz w:val="28"/>
           <w:szCs w:val="28"/>
         </w:rPr>
-        <w:t>Alterar Nota</w:t>
-      </w:r>
-    </w:p>
-    <w:p>
-      <w:r>
-        <w:t xml:space="preserve">O </w:t>
-      </w:r>
-      <w:r>
-        <w:t>Usuário insere o número referente ao aluno</w:t>
-      </w:r>
-    </w:p>
-    <w:p>
-      <w:r>
-        <w:t xml:space="preserve">O sistema procura os dados referentes ao índice </w:t>
-      </w:r>
-    </w:p>
-    <w:p>
-      <w:r>
-        <w:t>O Usuário coloca o a nova nota</w:t>
-      </w:r>
-    </w:p>
-    <w:p>
-      <w:r>
-        <w:t>O sistema sobrepõe a nota nova sobre a nota antiga</w:t>
-      </w:r>
-    </w:p>
-    <w:p>
-      <w:r>
-        <w:t>O sistema atualiza o Banco de Dados</w:t>
-      </w:r>
-    </w:p>
-    <w:p>
-      <w:r>
-        <w:t>O sistema confirma a alteração</w:t>
-      </w:r>
-    </w:p>
-    <w:p/>
-    <w:p>
-      <w:pPr>
+      </w:pPr>
+      <w:r>
         <w:rPr>
           <w:b/>
           <w:bCs/>
           <w:sz w:val="28"/>
           <w:szCs w:val="28"/>
         </w:rPr>
-      </w:pPr>
-      <w:r>
+        <w:t>Excluir Nota</w:t>
+      </w:r>
+    </w:p>
+    <w:p>
+      <w:pPr>
+        <w:rPr>
+          <w:sz w:val="20"/>
+          <w:szCs w:val="20"/>
+        </w:rPr>
+      </w:pPr>
+      <w:r>
+        <w:rPr>
+          <w:sz w:val="20"/>
+          <w:szCs w:val="20"/>
+        </w:rPr>
+        <w:t>O Usuário insere o número referente ao aluno</w:t>
+      </w:r>
+    </w:p>
+    <w:p>
+      <w:pPr>
+        <w:rPr>
+          <w:sz w:val="20"/>
+          <w:szCs w:val="20"/>
+        </w:rPr>
+      </w:pPr>
+      <w:r>
+        <w:rPr>
+          <w:sz w:val="20"/>
+          <w:szCs w:val="20"/>
+        </w:rPr>
+        <w:t xml:space="preserve">O sistema procura os dados referentes ao índice </w:t>
+      </w:r>
+    </w:p>
+    <w:p>
+      <w:pPr>
+        <w:rPr>
+          <w:sz w:val="20"/>
+          <w:szCs w:val="20"/>
+        </w:rPr>
+      </w:pPr>
+      <w:r>
+        <w:rPr>
+          <w:sz w:val="20"/>
+          <w:szCs w:val="20"/>
+        </w:rPr>
+        <w:t>O usuário confirma a exclusão</w:t>
+      </w:r>
+    </w:p>
+    <w:p>
+      <w:pPr>
+        <w:rPr>
+          <w:sz w:val="20"/>
+          <w:szCs w:val="20"/>
+        </w:rPr>
+      </w:pPr>
+      <w:r>
+        <w:rPr>
+          <w:sz w:val="20"/>
+          <w:szCs w:val="20"/>
+        </w:rPr>
+        <w:t xml:space="preserve">O sistema </w:t>
+      </w:r>
+      <w:r>
+        <w:rPr>
+          <w:sz w:val="20"/>
+          <w:szCs w:val="20"/>
+        </w:rPr>
+        <w:t>deleta o aluno e a nota do índice escrito</w:t>
+      </w:r>
+    </w:p>
+    <w:p>
+      <w:pPr>
+        <w:rPr>
+          <w:sz w:val="20"/>
+          <w:szCs w:val="20"/>
+        </w:rPr>
+      </w:pPr>
+      <w:r>
+        <w:rPr>
+          <w:sz w:val="20"/>
+          <w:szCs w:val="20"/>
+        </w:rPr>
+        <w:t>O sistema confirma a exclusão</w:t>
+      </w:r>
+    </w:p>
+    <w:p>
+      <w:pPr>
+        <w:rPr>
+          <w:b/>
+          <w:bCs/>
+        </w:rPr>
+      </w:pPr>
+      <w:r>
+        <w:rPr>
+          <w:b/>
+          <w:bCs/>
+        </w:rPr>
+        <w:t>Fluxo Alternativo</w:t>
+      </w:r>
+    </w:p>
+    <w:p>
+      <w:pPr>
+        <w:rPr>
+          <w:sz w:val="20"/>
+          <w:szCs w:val="20"/>
+        </w:rPr>
+      </w:pPr>
+      <w:r>
+        <w:rPr>
+          <w:sz w:val="20"/>
+          <w:szCs w:val="20"/>
+        </w:rPr>
+        <w:t>Caso o usuário não insira um index válido, o sistema vai bloquear e vai mandar inserir novamente</w:t>
+      </w:r>
+    </w:p>
+    <w:p>
+      <w:pPr>
+        <w:rPr>
+          <w:sz w:val="20"/>
+          <w:szCs w:val="20"/>
+        </w:rPr>
+      </w:pPr>
+      <w:r>
+        <w:rPr>
+          <w:sz w:val="20"/>
+          <w:szCs w:val="20"/>
+        </w:rPr>
+        <w:t>Caso o usuário não escolha nenhuma opção no momento de confirmar, vai mandar uma mensagem de erro e retornar à parte inicial</w:t>
+      </w:r>
+    </w:p>
+    <w:p>
+      <w:pPr>
+        <w:rPr>
+          <w:sz w:val="20"/>
+          <w:szCs w:val="20"/>
+        </w:rPr>
+      </w:pPr>
+    </w:p>
+    <w:p/>
+    <w:p>
+      <w:pPr>
         <w:rPr>
           <w:b/>
           <w:bCs/>
           <w:sz w:val="28"/>
           <w:szCs w:val="28"/>
         </w:rPr>
-        <w:t>Excluir</w:t>
-      </w:r>
+      </w:pPr>
       <w:r>
         <w:rPr>
           <w:b/>
@@ -221,63 +714,21 @@
           <w:sz w:val="28"/>
           <w:szCs w:val="28"/>
         </w:rPr>
-        <w:t xml:space="preserve"> Nota</w:t>
-      </w:r>
-    </w:p>
-    <w:p>
-      <w:r>
-        <w:t>O Usuário insere o número referente ao aluno</w:t>
-      </w:r>
-    </w:p>
-    <w:p>
-      <w:r>
-        <w:t xml:space="preserve">O sistema procura os dados referentes ao índice </w:t>
-      </w:r>
-    </w:p>
-    <w:p>
-      <w:r>
-        <w:t>O usuário confirma a exclusão</w:t>
-      </w:r>
-    </w:p>
-    <w:p/>
-    <w:p>
-      <w:r>
-        <w:t xml:space="preserve">O sistema </w:t>
-      </w:r>
-      <w:r>
-        <w:t>deleta o aluno e a nota do índice escrito</w:t>
-      </w:r>
-    </w:p>
-    <w:p>
-      <w:r>
-        <w:t xml:space="preserve">O sistema confirma a </w:t>
-      </w:r>
-      <w:r>
-        <w:t>exclusão</w:t>
-      </w:r>
-    </w:p>
-    <w:p/>
-    <w:p>
-      <w:pPr>
-        <w:rPr>
-          <w:b/>
-          <w:bCs/>
-          <w:sz w:val="28"/>
-          <w:szCs w:val="28"/>
-        </w:rPr>
-      </w:pPr>
-      <w:r>
-        <w:rPr>
-          <w:b/>
-          <w:bCs/>
-          <w:sz w:val="28"/>
-          <w:szCs w:val="28"/>
-        </w:rPr>
         <w:t>Sair</w:t>
       </w:r>
     </w:p>
     <w:p>
-      <w:r>
+      <w:pPr>
+        <w:rPr>
+          <w:sz w:val="20"/>
+          <w:szCs w:val="20"/>
+        </w:rPr>
+      </w:pPr>
+      <w:r>
+        <w:rPr>
+          <w:sz w:val="20"/>
+          <w:szCs w:val="20"/>
+        </w:rPr>
         <w:t>O Sistema finaliza</w:t>
       </w:r>
     </w:p>
@@ -301,7 +752,7 @@
 </file>
 
 <file path=word/numbering.xml><?xml version="1.0" encoding="utf-8"?>
-<w:numbering xmlns:wpc="http://schemas.microsoft.com/office/word/2010/wordprocessingCanvas" xmlns:cx="http://schemas.microsoft.com/office/drawing/2014/chartex" xmlns:cx1="http://schemas.microsoft.com/office/drawing/2015/9/8/chartex" xmlns:cx2="http://schemas.microsoft.com/office/drawing/2015/10/21/chartex" xmlns:cx3="http://schemas.microsoft.com/office/drawing/2016/5/9/chartex" xmlns:cx4="http://schemas.microsoft.com/office/drawing/2016/5/10/chartex" xmlns:cx5="http://schemas.microsoft.com/office/drawing/2016/5/11/chartex" xmlns:cx6="http://schemas.microsoft.com/office/drawing/2016/5/12/chartex" xmlns:cx7="http://schemas.microsoft.com/office/drawing/2016/5/13/chartex" xmlns:cx8="http://schemas.microsoft.com/office/drawing/2016/5/14/chartex" xmlns:mc="http://schemas.openxmlformats.org/markup-compatibility/2006" xmlns:aink="http://schemas.microsoft.com/office/drawing/2016/ink" xmlns:am3d="http://schemas.microsoft.com/office/drawing/2017/model3d" xmlns:o="urn:schemas-microsoft-com:office:office" xmlns:oel="http://schemas.microsoft.com/office/2019/extlst" xmlns:r="http://schemas.openxmlformats.org/officeDocument/2006/relationships" xmlns:m="http://schemas.openxmlformats.org/officeDocument/2006/math" xmlns:v="urn:schemas-microsoft-com:vml" xmlns:wp14="http://schemas.microsoft.com/office/word/2010/wordprocessingDrawing" xmlns:wp="http://schemas.openxmlformats.org/drawingml/2006/wordprocessingDrawing" xmlns:w10="urn:schemas-microsoft-com:office:word" xmlns:w="http://schemas.openxmlformats.org/wordprocessingml/2006/main" xmlns:w14="http://schemas.microsoft.com/office/word/2010/wordml" xmlns:w15="http://schemas.microsoft.com/office/word/2012/wordml" xmlns:w16cex="http://schemas.microsoft.com/office/word/2018/wordml/cex" xmlns:w16cid="http://schemas.microsoft.com/office/word/2016/wordml/cid" xmlns:w16="http://schemas.microsoft.com/office/word/2018/wordml" xmlns:w16sdtdh="http://schemas.microsoft.com/office/word/2020/wordml/sdtdatahash" xmlns:w16se="http://schemas.microsoft.com/office/word/2015/wordml/symex" xmlns:wpg="http://schemas.microsoft.com/office/word/2010/wordprocessingGroup" xmlns:wpi="http://schemas.microsoft.com/office/word/2010/wordprocessingInk" xmlns:wne="http://schemas.microsoft.com/office/word/2006/wordml" xmlns:wps="http://schemas.microsoft.com/office/word/2010/wordprocessingShape" mc:Ignorable="w14 w15 w16se w16cid w16 w16cex w16sdtdh wp14">
+<w:numbering xmlns:wpc="http://schemas.microsoft.com/office/word/2010/wordprocessingCanvas" xmlns:cx="http://schemas.microsoft.com/office/drawing/2014/chartex" xmlns:cx1="http://schemas.microsoft.com/office/drawing/2015/9/8/chartex" xmlns:cx2="http://schemas.microsoft.com/office/drawing/2015/10/21/chartex" xmlns:cx3="http://schemas.microsoft.com/office/drawing/2016/5/9/chartex" xmlns:cx4="http://schemas.microsoft.com/office/drawing/2016/5/10/chartex" xmlns:cx5="http://schemas.microsoft.com/office/drawing/2016/5/11/chartex" xmlns:cx6="http://schemas.microsoft.com/office/drawing/2016/5/12/chartex" xmlns:cx7="http://schemas.microsoft.com/office/drawing/2016/5/13/chartex" xmlns:cx8="http://schemas.microsoft.com/office/drawing/2016/5/14/chartex" xmlns:mc="http://schemas.openxmlformats.org/markup-compatibility/2006" xmlns:aink="http://schemas.microsoft.com/office/drawing/2016/ink" xmlns:am3d="http://schemas.microsoft.com/office/drawing/2017/model3d" xmlns:o="urn:schemas-microsoft-com:office:office" xmlns:r="http://schemas.openxmlformats.org/officeDocument/2006/relationships" xmlns:m="http://schemas.openxmlformats.org/officeDocument/2006/math" xmlns:v="urn:schemas-microsoft-com:vml" xmlns:wp14="http://schemas.microsoft.com/office/word/2010/wordprocessingDrawing" xmlns:wp="http://schemas.openxmlformats.org/drawingml/2006/wordprocessingDrawing" xmlns:w10="urn:schemas-microsoft-com:office:word" xmlns:w="http://schemas.openxmlformats.org/wordprocessingml/2006/main" xmlns:w14="http://schemas.microsoft.com/office/word/2010/wordml" xmlns:w15="http://schemas.microsoft.com/office/word/2012/wordml" xmlns:w16cex="http://schemas.microsoft.com/office/word/2018/wordml/cex" xmlns:w16cid="http://schemas.microsoft.com/office/word/2016/wordml/cid" xmlns:w16="http://schemas.microsoft.com/office/word/2018/wordml" xmlns:w16sdtdh="http://schemas.microsoft.com/office/word/2020/wordml/sdtdatahash" xmlns:w16se="http://schemas.microsoft.com/office/word/2015/wordml/symex" xmlns:wpg="http://schemas.microsoft.com/office/word/2010/wordprocessingGroup" xmlns:wpi="http://schemas.microsoft.com/office/word/2010/wordprocessingInk" xmlns:wne="http://schemas.microsoft.com/office/word/2006/wordml" xmlns:wps="http://schemas.microsoft.com/office/word/2010/wordprocessingShape" mc:Ignorable="w14 w15 w16se w16cid w16 w16cex w16sdtdh wp14">
   <w:abstractNum w:abstractNumId="0" w15:restartNumberingAfterBreak="0">
     <w:nsid w:val="21DB7EED"/>
     <w:multiLevelType w:val="hybridMultilevel"/>
@@ -395,7 +846,7 @@
       </w:pPr>
     </w:lvl>
   </w:abstractNum>
-  <w:num w:numId="1" w16cid:durableId="1130443194">
+  <w:num w:numId="1">
     <w:abstractNumId w:val="0"/>
   </w:num>
 </w:numbering>
@@ -801,6 +1252,7 @@
   <w:style w:type="paragraph" w:default="1" w:styleId="Normal">
     <w:name w:val="Normal"/>
     <w:qFormat/>
+    <w:rsid w:val="00F83951"/>
   </w:style>
   <w:style w:type="paragraph" w:styleId="Ttulo1">
     <w:name w:val="heading 1"/>

</xml_diff>